<commit_message>
Justifica todo el texto (tesis y dossier) + pestaña de Descargas
- PDF/Word de la tesis y el dossier ahora con texto justificado y
  guionado automatico (es_ES) para evitar rios en los margenes.
- Corrige fragmentacion de listas: las lineas de continuacion sangradas
  se funden en el mismo item (glosario, bibliografia anotada, etc.).
- Nueva seccion/pestana Descargas en la plataforma con descarga directa
  de Tesis (PDF/Word), presentacion (PPTX) y Dossier (PDF/Word) + GitHub.

Co-Authored-By: Claude Opus 4.8 <noreply@anthropic.com>
</commit_message>
<xml_diff>
--- a/docs/Dossier_Investigacion.docx
+++ b/docs/Dossier_Investigacion.docx
@@ -543,12 +543,7 @@
         <w:t>Codelco</w:t>
       </w:r>
       <w:r>
-        <w:t xml:space="preserve"> (estatal): producción total 1.441.886 t en 2024; mayor productora del</w:t>
-      </w:r>
-    </w:p>
-    <w:p>
-      <w:r>
-        <w:t>mundo y pilar fiscal.</w:t>
+        <w:t xml:space="preserve"> (estatal): producción total 1.441.886 t en 2024; mayor productora del mundo y pilar fiscal.</w:t>
       </w:r>
     </w:p>
     <w:p>
@@ -563,12 +558,7 @@
         <w:t>Antofagasta plc</w:t>
       </w:r>
       <w:r>
-        <w:t xml:space="preserve"> (grupo Luksic, cotiza en Londres): minas Los Pelambres,</w:t>
-      </w:r>
-    </w:p>
-    <w:p>
-      <w:r>
-        <w:t>Centinela, Antucoya y Zaldívar; 314.900 t en el primer semestre de 2025 (Mining.com).</w:t>
+        <w:t xml:space="preserve"> (grupo Luksic, cotiza en Londres): minas Los Pelambres, Centinela, Antucoya y Zaldívar; 314.900 t en el primer semestre de 2025 (Mining.com).</w:t>
       </w:r>
     </w:p>
     <w:p>
@@ -583,12 +573,7 @@
         <w:t>Pucobre (Sociedad Punta del Cobre S.A.)</w:t>
       </w:r>
       <w:r>
-        <w:t>: mediana minería, sede en Copiapó</w:t>
-      </w:r>
-    </w:p>
-    <w:p>
-      <w:r>
-        <w:t>(Atacama), ~35.000 t anuales a 2023; cotiza en la Bolsa de Santiago como "PUCOBRE" (Guía Minera).</w:t>
+        <w:t>: mediana minería, sede en Copiapó (Atacama), ~35.000 t anuales a 2023; cotiza en la Bolsa de Santiago como "PUCOBRE" (Guía Minera).</w:t>
       </w:r>
     </w:p>
     <w:p>
@@ -1101,12 +1086,7 @@
         <w:t>Markowitz, H. (1952).</w:t>
       </w:r>
       <w:r>
-        <w:t xml:space="preserve"> Portfolio selection. *Journal of Finance, 7*(1), 77–91. https://doi.org/10.1111/j.1540-6261.1952.tb01525.x</w:t>
-      </w:r>
-    </w:p>
-    <w:p>
-      <w:r>
-        <w:t>— Funda la teoría de cartera media–varianza; cimiento para discutir el riesgo idiosincrático de una minera concentrada en un solo *commodity*.</w:t>
+        <w:t xml:space="preserve"> Portfolio selection. *Journal of Finance, 7*(1), 77–91. https://doi.org/10.1111/j.1540-6261.1952.tb01525.x — Funda la teoría de cartera media–varianza; cimiento para discutir el riesgo idiosincrático de una minera concentrada en un solo *commodity*.</w:t>
       </w:r>
     </w:p>
     <w:p>
@@ -1121,12 +1101,7 @@
         <w:t>Sharpe, W. F. (1964).</w:t>
       </w:r>
       <w:r>
-        <w:t xml:space="preserve"> Capital asset prices. *Journal of Finance, 19*(3), 425–442. https://doi.org/10.1111/j.1540-6261.1964.tb02865.x</w:t>
-      </w:r>
-    </w:p>
-    <w:p>
-      <w:r>
-        <w:t>— Deriva el CAPM y la beta; *benchmark* contra el modelo multifactorial con el cobre como factor.</w:t>
+        <w:t xml:space="preserve"> Capital asset prices. *Journal of Finance, 19*(3), 425–442. https://doi.org/10.1111/j.1540-6261.1964.tb02865.x — Deriva el CAPM y la beta; *benchmark* contra el modelo multifactorial con el cobre como factor.</w:t>
       </w:r>
     </w:p>
     <w:p>
@@ -1141,12 +1116,7 @@
         <w:t>Fama, E. F. (1970).</w:t>
       </w:r>
       <w:r>
-        <w:t xml:space="preserve"> Efficient capital markets. *Journal of Finance, 25*(2), 383–417. https://doi.org/10.1111/j.1540-6261.1970.tb00518.x</w:t>
-      </w:r>
-    </w:p>
-    <w:p>
-      <w:r>
-        <w:t>— Sistematiza la hipótesis de mercados eficientes; marco para interpretar el descubrimiento de precios (incorporación instantánea vs. rezagada del cobre).</w:t>
+        <w:t xml:space="preserve"> Efficient capital markets. *Journal of Finance, 25*(2), 383–417. https://doi.org/10.1111/j.1540-6261.1970.tb00518.x — Sistematiza la hipótesis de mercados eficientes; marco para interpretar el descubrimiento de precios (incorporación instantánea vs. rezagada del cobre).</w:t>
       </w:r>
     </w:p>
     <w:p>
@@ -1161,12 +1131,7 @@
         <w:t>Ross, S. A. (1976).</w:t>
       </w:r>
       <w:r>
-        <w:t xml:space="preserve"> The arbitrage theory of capital asset pricing. *Journal of Economic Theory, 13*(3), 341–360. https://doi.org/10.1016/0022-0531(76)90046-6</w:t>
-      </w:r>
-    </w:p>
-    <w:p>
-      <w:r>
-        <w:t>— Propone el APT multifactorial; justifica incluir factores macro y de *commodities*.</w:t>
+        <w:t xml:space="preserve"> The arbitrage theory of capital asset pricing. *Journal of Economic Theory, 13*(3), 341–360. https://doi.org/10.1016/0022-0531(76)90046-6 — Propone el APT multifactorial; justifica incluir factores macro y de *commodities*.</w:t>
       </w:r>
     </w:p>
     <w:p>
@@ -1189,12 +1154,7 @@
         <w:t>Chen, N.-F., Roll, R., &amp; Ross, S. A. (1986).</w:t>
       </w:r>
       <w:r>
-        <w:t xml:space="preserve"> Economic forces and the stock market. *Journal of Business, 59*(3), 383–403. https://www.jstor.org/stable/2352710</w:t>
-      </w:r>
-    </w:p>
-    <w:p>
-      <w:r>
-        <w:t>— Operacionaliza el APT con factores macro valorados; modelo seminal de la especificación de retornos mineros.</w:t>
+        <w:t xml:space="preserve"> Economic forces and the stock market. *Journal of Business, 59*(3), 383–403. https://www.jstor.org/stable/2352710 — Operacionaliza el APT con factores macro valorados; modelo seminal de la especificación de retornos mineros.</w:t>
       </w:r>
     </w:p>
     <w:p>
@@ -1209,12 +1169,7 @@
         <w:t>Sadorsky, P. (2001).</w:t>
       </w:r>
       <w:r>
-        <w:t xml:space="preserve"> Risk factors in stock returns of Canadian oil and gas companies. *Energy Economics, 23*(1), 17–28. https://doi.org/10.1016/S0140-9883(00)00072-4</w:t>
-      </w:r>
-    </w:p>
-    <w:p>
-      <w:r>
-        <w:t>— Tipo de cambio, precio del petróleo y tasas afectan a las energéticas; análogo metodológico directo (petróleo→cobre, energía→minería).</w:t>
+        <w:t xml:space="preserve"> Risk factors in stock returns of Canadian oil and gas companies. *Energy Economics, 23*(1), 17–28. https://doi.org/10.1016/S0140-9883(00)00072-4 — Tipo de cambio, precio del petróleo y tasas afectan a las energéticas; análogo metodológico directo (petróleo→cobre, energía→minería).</w:t>
       </w:r>
     </w:p>
     <w:p>
@@ -1229,12 +1184,7 @@
         <w:t>Kilian, L., &amp; Park, C. (2009).</w:t>
       </w:r>
       <w:r>
-        <w:t xml:space="preserve"> The impact of oil price shocks on the U.S. stock market. *International Economic Review, 50*(4), 1267–1287. https://doi.org/10.1111/j.1468-2354.2009.00568.x</w:t>
-      </w:r>
-    </w:p>
-    <w:p>
-      <w:r>
-        <w:t>— El efecto sobre las acciones depende del origen del shock (oferta vs. demanda).</w:t>
+        <w:t xml:space="preserve"> The impact of oil price shocks on the U.S. stock market. *International Economic Review, 50*(4), 1267–1287. https://doi.org/10.1111/j.1468-2354.2009.00568.x — El efecto sobre las acciones depende del origen del shock (oferta vs. demanda).</w:t>
       </w:r>
     </w:p>
     <w:p>
@@ -1257,12 +1207,7 @@
         <w:t>Chen, Y.-c., &amp; Rogoff, K. (2003).</w:t>
       </w:r>
       <w:r>
-        <w:t xml:space="preserve"> Commodity currencies. *Journal of International Economics, 60*(1), 133–160. https://doi.org/10.1016/S0022-1996(02)00072-7</w:t>
-      </w:r>
-    </w:p>
-    <w:p>
-      <w:r>
-        <w:t>— Relación robusta precio del *commodity*↔tipo de cambio real; sustenta el canal cobre→peso.</w:t>
+        <w:t xml:space="preserve"> Commodity currencies. *Journal of International Economics, 60*(1), 133–160. https://doi.org/10.1016/S0022-1996(02)00072-7 — Relación robusta precio del *commodity*↔tipo de cambio real; sustenta el canal cobre→peso.</w:t>
       </w:r>
     </w:p>
     <w:p>
@@ -1277,12 +1222,7 @@
         <w:t>Cashin, P., McDermott, C. J., &amp; Scott, A. (2002).</w:t>
       </w:r>
       <w:r>
-        <w:t xml:space="preserve"> Booms and slumps in world commodity prices. *Journal of Development Economics, 69*(1), 277–296. https://doi.org/10.1016/S0304-3878(02)00062-7</w:t>
-      </w:r>
-    </w:p>
-    <w:p>
-      <w:r>
-        <w:t>— Ciclos asimétricos (las caídas duran más); motiva especificaciones asimétricas (NARDL).</w:t>
+        <w:t xml:space="preserve"> Booms and slumps in world commodity prices. *Journal of Development Economics, 69*(1), 277–296. https://doi.org/10.1016/S0304-3878(02)00062-7 — Ciclos asimétricos (las caídas duran más); motiva especificaciones asimétricas (NARDL).</w:t>
       </w:r>
     </w:p>
     <w:p>
@@ -1297,12 +1237,7 @@
         <w:t>Cashin, P., &amp; McDermott, C. J. (2002).</w:t>
       </w:r>
       <w:r>
-        <w:t xml:space="preserve"> The long-run behavior of commodity prices. *IMF Staff Papers, 49*(2), 175–199.</w:t>
-      </w:r>
-    </w:p>
-    <w:p>
-      <w:r>
-        <w:t>— Leve tendencia decreciente y alta variabilidad de los precios reales (1862–1999).</w:t>
+        <w:t xml:space="preserve"> The long-run behavior of commodity prices. *IMF Staff Papers, 49*(2), 175–199. — Leve tendencia decreciente y alta variabilidad de los precios reales (1862–1999).</w:t>
       </w:r>
     </w:p>
     <w:p>
@@ -1317,12 +1252,7 @@
         <w:t>Frankel, J. A. (2006).</w:t>
       </w:r>
       <w:r>
-        <w:t xml:space="preserve"> *The effect of monetary policy on real commodity prices* (NBER WP 12713). https://doi.org/10.3386/w12713</w:t>
-      </w:r>
-    </w:p>
-    <w:p>
-      <w:r>
-        <w:t xml:space="preserve">— Tasas reales bajas elevan precios reales de *commodities* (overshooting). </w:t>
+        <w:t xml:space="preserve"> *The effect of monetary policy on real commodity prices* (NBER WP 12713). https://doi.org/10.3386/w12713 — Tasas reales bajas elevan precios reales de *commodities* (overshooting). </w:t>
       </w:r>
       <w:r>
         <w:rPr>
@@ -1344,12 +1274,7 @@
         <w:t>Borensztein, E., &amp; Reinhart, C. M. (1994).</w:t>
       </w:r>
       <w:r>
-        <w:t xml:space="preserve"> The macroeconomic determinants of commodity prices. *IMF Staff Papers, 41*(2), 236–261. https://doi.org/10.2307/3867508</w:t>
-      </w:r>
-    </w:p>
-    <w:p>
-      <w:r>
-        <w:t>— Marco estructural de los precios de *commodities* incorporando oferta.</w:t>
+        <w:t xml:space="preserve"> The macroeconomic determinants of commodity prices. *IMF Staff Papers, 41*(2), 236–261. https://doi.org/10.2307/3867508 — Marco estructural de los precios de *commodities* incorporando oferta.</w:t>
       </w:r>
     </w:p>
     <w:p>
@@ -1364,12 +1289,7 @@
         <w:t>Gargano, A., &amp; Timmermann, A. (2014).</w:t>
       </w:r>
       <w:r>
-        <w:t xml:space="preserve"> Forecasting commodity price indexes. *International Journal of Forecasting, 30*(3), 825–843. https://doi.org/10.1016/j.ijforecast.2013.09.003</w:t>
-      </w:r>
-    </w:p>
-    <w:p>
-      <w:r>
-        <w:t>— Predictibilidad fuera de muestra de índices de *commodities*; respalda la validación OOS.</w:t>
+        <w:t xml:space="preserve"> Forecasting commodity price indexes. *International Journal of Forecasting, 30*(3), 825–843. https://doi.org/10.1016/j.ijforecast.2013.09.003 — Predictibilidad fuera de muestra de índices de *commodities*; respalda la validación OOS.</w:t>
       </w:r>
     </w:p>
     <w:p>
@@ -1384,12 +1304,7 @@
         <w:t>De Gregorio, J., &amp; Labbé, F. (2011).</w:t>
       </w:r>
       <w:r>
-        <w:t xml:space="preserve"> *Copper, the real exchange rate and macroeconomic fluctuations in Chile* (Documento de Trabajo N°640). Banco Central de Chile. https://www.bcentral.cl/en/content/-/details/working-papers-n-640</w:t>
-      </w:r>
-    </w:p>
-    <w:p>
-      <w:r>
-        <w:t>— Evidencia chilena del nexo cobre–tipo de cambio real–términos de intercambio.</w:t>
+        <w:t xml:space="preserve"> *Copper, the real exchange rate and macroeconomic fluctuations in Chile* (Documento de Trabajo N°640). Banco Central de Chile. https://www.bcentral.cl/en/content/-/details/working-papers-n-640 — Evidencia chilena del nexo cobre–tipo de cambio real–términos de intercambio.</w:t>
       </w:r>
     </w:p>
     <w:p>
@@ -1412,12 +1327,7 @@
         <w:t>Amihud, Y. (2002).</w:t>
       </w:r>
       <w:r>
-        <w:t xml:space="preserve"> Illiquidity and stock returns. *Journal of Financial Markets, 5*(1), 31–56. https://doi.org/10.1016/S1386-4181(01)00024-6</w:t>
-      </w:r>
-    </w:p>
-    <w:p>
-      <w:r>
-        <w:t>— Introduce ILLIQ; medida central para Pucobre y la prima de iliquidez.</w:t>
+        <w:t xml:space="preserve"> Illiquidity and stock returns. *Journal of Financial Markets, 5*(1), 31–56. https://doi.org/10.1016/S1386-4181(01)00024-6 — Introduce ILLIQ; medida central para Pucobre y la prima de iliquidez.</w:t>
       </w:r>
     </w:p>
     <w:p>
@@ -1432,12 +1342,7 @@
         <w:t>Pástor, L., &amp; Stambaugh, R. F. (2003).</w:t>
       </w:r>
       <w:r>
-        <w:t xml:space="preserve"> Liquidity risk and expected stock returns. *Journal of Political Economy, 111*(3), 642–685. https://doi.org/10.1086/374184</w:t>
-      </w:r>
-    </w:p>
-    <w:p>
-      <w:r>
-        <w:t>— Factor de liquidez sistémica valorado; distingue nivel de iliquidez de riesgo de liquidez.</w:t>
+        <w:t xml:space="preserve"> Liquidity risk and expected stock returns. *Journal of Political Economy, 111*(3), 642–685. https://doi.org/10.1086/374184 — Factor de liquidez sistémica valorado; distingue nivel de iliquidez de riesgo de liquidez.</w:t>
       </w:r>
     </w:p>
     <w:p>
@@ -1452,12 +1357,7 @@
         <w:t>Acharya, V. V., &amp; Pedersen, L. H. (2005).</w:t>
       </w:r>
       <w:r>
-        <w:t xml:space="preserve"> Asset pricing with liquidity risk. *Journal of Financial Economics, 77*(2), 375–410. https://doi.org/10.1016/j.jfineco.2004.06.007</w:t>
-      </w:r>
-    </w:p>
-    <w:p>
-      <w:r>
-        <w:t>— CAPM ajustado por liquidez; marco para incorporar iliquidez en la valoración.</w:t>
+        <w:t xml:space="preserve"> Asset pricing with liquidity risk. *Journal of Financial Economics, 77*(2), 375–410. https://doi.org/10.1016/j.jfineco.2004.06.007 — CAPM ajustado por liquidez; marco para incorporar iliquidez en la valoración.</w:t>
       </w:r>
     </w:p>
     <w:p>
@@ -1472,12 +1372,7 @@
         <w:t>Bekaert, G., Harvey, C. R., &amp; Lundblad, C. (2007).</w:t>
       </w:r>
       <w:r>
-        <w:t xml:space="preserve"> Liquidity and expected returns: lessons from emerging markets. *Review of Financial Studies, 20*(6), 1783–1831. https://doi.org/10.1093/rfs/hhm030</w:t>
-      </w:r>
-    </w:p>
-    <w:p>
-      <w:r>
-        <w:t>— Proporción de retornos cero como proxy; la liquidez predice retornos en emergentes.</w:t>
+        <w:t xml:space="preserve"> Liquidity and expected returns: lessons from emerging markets. *Review of Financial Studies, 20*(6), 1783–1831. https://doi.org/10.1093/rfs/hhm030 — Proporción de retornos cero como proxy; la liquidez predice retornos en emergentes.</w:t>
       </w:r>
     </w:p>
     <w:p>
@@ -1492,12 +1387,7 @@
         <w:t>Amihud, Y., Hameed, A., Kang, W., &amp; Zhang, H. (2015).</w:t>
       </w:r>
       <w:r>
-        <w:t xml:space="preserve"> The illiquidity premium: international evidence. *Journal of Financial Economics, 117*(2), 350–368. https://doi.org/10.1016/j.jfineco.2015.04.005</w:t>
-      </w:r>
-    </w:p>
-    <w:p>
-      <w:r>
-        <w:t>— Prima de iliquidez en 45 países, mayor en menos desarrollados.</w:t>
+        <w:t xml:space="preserve"> The illiquidity premium: international evidence. *Journal of Financial Economics, 117*(2), 350–368. https://doi.org/10.1016/j.jfineco.2015.04.005 — Prima de iliquidez en 45 países, mayor en menos desarrollados.</w:t>
       </w:r>
     </w:p>
     <w:p>
@@ -1512,12 +1402,7 @@
         <w:t>Roll, R. (1984).</w:t>
       </w:r>
       <w:r>
-        <w:t xml:space="preserve"> A simple implicit measure of the effective bid-ask spread. *Journal of Finance, 39*(4), 1127–1139. https://doi.org/10.1111/j.1540-6261.1984.tb03897.x</w:t>
-      </w:r>
-    </w:p>
-    <w:p>
-      <w:r>
-        <w:t>— Spread efectivo desde la autocovarianza de retornos.</w:t>
+        <w:t xml:space="preserve"> A simple implicit measure of the effective bid-ask spread. *Journal of Finance, 39*(4), 1127–1139. https://doi.org/10.1111/j.1540-6261.1984.tb03897.x — Spread efectivo desde la autocovarianza de retornos.</w:t>
       </w:r>
     </w:p>
     <w:p>
@@ -1532,12 +1417,7 @@
         <w:t>Kyle, A. S. (1985).</w:t>
       </w:r>
       <w:r>
-        <w:t xml:space="preserve"> Continuous auctions and insider trading. *Econometrica, 53*(6), 1315–1335. https://doi.org/10.2307/1913210</w:t>
-      </w:r>
-    </w:p>
-    <w:p>
-      <w:r>
-        <w:t>— Formaliza el impacto de precio y la profundidad del mercado.</w:t>
+        <w:t xml:space="preserve"> Continuous auctions and insider trading. *Econometrica, 53*(6), 1315–1335. https://doi.org/10.2307/1913210 — Formaliza el impacto de precio y la profundidad del mercado.</w:t>
       </w:r>
     </w:p>
     <w:p>
@@ -1552,12 +1432,7 @@
         <w:t>Lesmond, D. A., Ogden, J. P., &amp; Trzcinka, C. A. (1999).</w:t>
       </w:r>
       <w:r>
-        <w:t xml:space="preserve"> A new estimate of transaction costs. *Review of Financial Studies, 12*(5), 1113–1141. https://doi.org/10.1093/rfs/12.5.1113</w:t>
-      </w:r>
-    </w:p>
-    <w:p>
-      <w:r>
-        <w:t>— Estimador de costos por incidencia de retornos cero, útil sin datos intradía.</w:t>
+        <w:t xml:space="preserve"> A new estimate of transaction costs. *Review of Financial Studies, 12*(5), 1113–1141. https://doi.org/10.1093/rfs/12.5.1113 — Estimador de costos por incidencia de retornos cero, útil sin datos intradía.</w:t>
       </w:r>
     </w:p>
     <w:p>
@@ -1572,12 +1447,7 @@
         <w:t>Hasbrouck, J. (1995).</w:t>
       </w:r>
       <w:r>
-        <w:t xml:space="preserve"> One security, many markets: determining the contributions to price discovery. *Journal of Finance, 50*(4), 1175–1199. https://doi.org/10.1111/j.1540-6261.1995.tb04054.x</w:t>
-      </w:r>
-    </w:p>
-    <w:p>
-      <w:r>
-        <w:t>— *Information share*; dónde se forma el precio de un activo cotizado en varios mercados.</w:t>
+        <w:t xml:space="preserve"> One security, many markets: determining the contributions to price discovery. *Journal of Finance, 50*(4), 1175–1199. https://doi.org/10.1111/j.1540-6261.1995.tb04054.x — *Information share*; dónde se forma el precio de un activo cotizado en varios mercados.</w:t>
       </w:r>
     </w:p>
     <w:p>
@@ -1796,12 +1666,7 @@
         <w:t>Díaz, J. D., Hansen, E., &amp; Cabrera, G. (2021).</w:t>
       </w:r>
       <w:r>
-        <w:t xml:space="preserve"> Economic drivers of commodity volatility: the case of copper. *Resources Policy, 73*, 102224. https://doi.org/10.1016/j.resourpol.2021.102224</w:t>
-      </w:r>
-    </w:p>
-    <w:p>
-      <w:r>
-        <w:t>— *Bayesian Model Averaging*: VIX, incertidumbre y fundamentos predicen la volatilidad del cobre. Autores con foco chileno.</w:t>
+        <w:t xml:space="preserve"> Economic drivers of commodity volatility: the case of copper. *Resources Policy, 73*, 102224. https://doi.org/10.1016/j.resourpol.2021.102224 — *Bayesian Model Averaging*: VIX, incertidumbre y fundamentos predicen la volatilidad del cobre. Autores con foco chileno.</w:t>
       </w:r>
     </w:p>
     <w:p>
@@ -1816,12 +1681,7 @@
         <w:t>Wallenstein, T., Mendiola, A., &amp; Chávez-Bedoya, L. (2022).</w:t>
       </w:r>
       <w:r>
-        <w:t xml:space="preserve"> *Analysis of the reaction of mining stocks to the development of copper prices* [Ponencia, CLADEA 2022]. https://cladea.org/wp-content/uploads/2022/01/316Thilo-Wallenstein-Alfredo-Mendiola-and-Luis-Chavez-Bedoya-Analysis-of-the-Reaction-of-Mining-Stocks-to-the-Development-of-Copper-Prices.pdf</w:t>
-      </w:r>
-    </w:p>
-    <w:p>
-      <w:r>
-        <w:t xml:space="preserve">— Reacción de acciones mineras al cobre en bolsas desarrolladas vs. Lima; segmentación significativa solo en la emergente. Antecedente regional muy cercano. </w:t>
+        <w:t xml:space="preserve"> *Analysis of the reaction of mining stocks to the development of copper prices* [Ponencia, CLADEA 2022]. https://cladea.org/wp-content/uploads/2022/01/316Thilo-Wallenstein-Alfredo-Mendiola-and-Luis-Chavez-Bedoya-Analysis-of-the-Reaction-of-Mining-Stocks-to-the-Development-of-Copper-Prices.pdf — Reacción de acciones mineras al cobre en bolsas desarrolladas vs. Lima; segmentación significativa solo en la emergente. Antecedente regional muy cercano. </w:t>
       </w:r>
       <w:r>
         <w:rPr>
@@ -2438,6 +2298,7 @@
     <w:rsid w:val="00FC693F"/>
     <w:pPr>
       <w:spacing w:after="160" w:line="300" w:lineRule="auto"/>
+      <w:jc w:val="both"/>
     </w:pPr>
     <w:rPr>
       <w:rFonts w:ascii="Segoe UI" w:hAnsi="Segoe UI"/>

</xml_diff>

<commit_message>
Notacion matematica con sub/superindices + corrige fragmentacion de citas
- PDF y Word: la notacion tipo LaTeX (r_i, beta_{i,k}, (1+k)^t, Sigma_{j=1}^{p})
  ahora se renderiza con subindices/superindices reales (142 runs en Word),
  protegiendo code spans para no danar tickers de Yahoo (^IRX) ni rutas
  snake_case (diccionario_datos.md).
- Corrige fragmentacion de blockquotes multi-linea (pregunta de investigacion,
  notas): se funden en un unico parrafo citado justificado.
- Plataforma: tarjetas de Descargas con tamano de archivo y micro-interaccion.

Co-Authored-By: Claude Opus 4.8 <noreply@anthropic.com>
</commit_message>
<xml_diff>
--- a/docs/Dossier_Investigacion.docx
+++ b/docs/Dossier_Investigacion.docx
@@ -45,23 +45,7 @@
         <w:pStyle w:val="IntenseQuote"/>
       </w:pPr>
       <w:r>
-        <w:t>Documento de investigación de apoyo a la tesis. Fuentes verificadas en la web</w:t>
-      </w:r>
-    </w:p>
-    <w:p>
-      <w:pPr>
-        <w:pStyle w:val="IntenseQuote"/>
-      </w:pPr>
-      <w:r>
-        <w:t>(Cochilco, Codelco, LME, Memoria Chilena, prensa especializada). Recopilado en</w:t>
-      </w:r>
-    </w:p>
-    <w:p>
-      <w:pPr>
-        <w:pStyle w:val="IntenseQuote"/>
-      </w:pPr>
-      <w:r>
-        <w:t>mayo de 2026.</w:t>
+        <w:t>Documento de investigación de apoyo a la tesis. Fuentes verificadas en la web (Cochilco, Codelco, LME, Memoria Chilena, prensa especializada). Recopilado en mayo de 2026.</w:t>
       </w:r>
     </w:p>
     <w:p>
@@ -614,7 +598,399 @@
         <w:pStyle w:val="IntenseQuote"/>
       </w:pPr>
       <w:r>
-        <w:t>Documento de investigación de apoyo a la tesis. Las citas fueron verificadas en los</w:t>
+        <w:t>Documento de investigación de apoyo a la tesis. Las citas fueron verificadas en los sitios de los editores y repositorios (Wiley, Elsevier/ScienceDirect, Oxford, University of Chicago Press, CFA Institute, Springer, Banco Central de Chile, NBER, CLADEA). Marcadas como "verificar" las no confirmadas plenamente.</w:t>
+      </w:r>
+    </w:p>
+    <w:p>
+      <w:r>
+        <w:t>Este estado del arte organiza la literatura en seis corrientes interrelacionadas. La pregunta —cómo se transmiten los choques macro-financieros, en particular el precio del cobre, a la valoración bursátil de las mineras chilenas, y cómo la (i)liquidez modula esa transmisión— se sitúa en la intersección de la teoría de valoración de activos, la economía de *commodities*, la literatura de *commodity currencies* y la microestructura de mercados emergentes.</w:t>
+      </w:r>
+    </w:p>
+    <w:p>
+      <w:pPr>
+        <w:pStyle w:val="Heading2"/>
+      </w:pPr>
+      <w:r>
+        <w:t>1. Factores macroeconómicos y retornos accionarios</w:t>
+      </w:r>
+    </w:p>
+    <w:p>
+      <w:r>
+        <w:t xml:space="preserve">La base conceptual es la *Arbitrage Pricing Theory* (Ross, 1976): los retornos responden linealmente a factores de riesgo sistemático no diversificable. La contrastación canónica es </w:t>
+      </w:r>
+      <w:r>
+        <w:rPr>
+          <w:b/>
+        </w:rPr>
+        <w:t>Chen, Roll &amp; Ross (1986)</w:t>
+      </w:r>
+      <w:r>
+        <w:t xml:space="preserve">, que muestra que innovaciones en la producción industrial, la inflación esperada y no esperada, el *spread* de plazos y el *spread* de riesgo de incumplimiento están sistemáticamente valoradas en el mercado accionario (doi: 10.1086/296344). </w:t>
+      </w:r>
+      <w:r>
+        <w:rPr>
+          <w:b/>
+        </w:rPr>
+        <w:t>Se sabe</w:t>
+      </w:r>
+      <w:r>
+        <w:t xml:space="preserve"> que los factores macro afectan los retornos de forma robusta en mercados desarrollados; </w:t>
+      </w:r>
+      <w:r>
+        <w:rPr>
+          <w:b/>
+        </w:rPr>
+        <w:t>se discute</w:t>
+      </w:r>
+      <w:r>
+        <w:t xml:space="preserve"> su estabilidad temporal y su transferibilidad a emergentes; </w:t>
+      </w:r>
+      <w:r>
+        <w:rPr>
+          <w:b/>
+        </w:rPr>
+        <w:t>vacío</w:t>
+      </w:r>
+      <w:r>
+        <w:t>: la APT no especifica los factores *a priori*, lo que abre la puerta a factores sectoriales (el precio del *commodity* subyacente) no capturados por los factores macro estándar.</w:t>
+      </w:r>
+    </w:p>
+    <w:p>
+      <w:pPr>
+        <w:pStyle w:val="Heading2"/>
+      </w:pPr>
+      <w:r>
+        <w:t>2. Precios de *commodities* (cobre, petróleo) y mercados accionarios</w:t>
+      </w:r>
+    </w:p>
+    <w:p>
+      <w:r>
+        <w:t xml:space="preserve">Para empresas de recursos, el precio del producto es plausiblemente el factor dominante. </w:t>
+      </w:r>
+      <w:r>
+        <w:rPr>
+          <w:b/>
+        </w:rPr>
+        <w:t>Mendiola, Wallenstein &amp; Chávez-Bedoya (2022)</w:t>
+      </w:r>
+      <w:r>
+        <w:t xml:space="preserve"> —"Analysis of the Reaction of Mining Stocks to the Development of Copper Prices" (CLADEA)— analizan mineras de cobre en NYSE, LSE, TSX y la Bolsa de Lima y documentan una relación </w:t>
+      </w:r>
+      <w:r>
+        <w:rPr>
+          <w:b/>
+        </w:rPr>
+        <w:t>positiva pero inelástica</w:t>
+      </w:r>
+      <w:r>
+        <w:t xml:space="preserve"> entre el precio del cobre y los retornos, con efectos de la crisis de 2008 más marcados en el mercado menos desarrollado (Lima). </w:t>
+      </w:r>
+      <w:r>
+        <w:rPr>
+          <w:b/>
+        </w:rPr>
+        <w:t>Kilian &amp; Park (2009)</w:t>
+      </w:r>
+      <w:r>
+        <w:t xml:space="preserve"> muestran que la respuesta de los retornos depende del *origen* del choque (oferta vs. demanda), explicando ~22% de la varianza de largo plazo de los retornos reales de EE. UU. (doi: 10.1111/j.1468-2354.2009.00568.x): </w:t>
+      </w:r>
+      <w:r>
+        <w:rPr>
+          <w:b/>
+        </w:rPr>
+        <w:t>no basta el nivel del precio; importa la naturaleza del choque</w:t>
+      </w:r>
+      <w:r>
+        <w:t xml:space="preserve">. </w:t>
+      </w:r>
+      <w:r>
+        <w:rPr>
+          <w:b/>
+        </w:rPr>
+        <w:t>Gorton &amp; Rouwenhorst (2006)</w:t>
+      </w:r>
+      <w:r>
+        <w:t xml:space="preserve"> muestran que un índice de futuros de *commodities* ofreció retornos comparables a las acciones con correlación negativa frente a acciones y bonos (doi: 10.2469/faj.v62.n2.4083). </w:t>
+      </w:r>
+      <w:r>
+        <w:rPr>
+          <w:b/>
+        </w:rPr>
+        <w:t>Discusión/vacío</w:t>
+      </w:r>
+      <w:r>
+        <w:t>: asimetrías (¿igual respuesta a alzas que a bajas?) y dinámica de corto vs. largo plazo; pocos trabajos descomponen el choque de cobre *y* examinan empresas en un mercado emergente ilíquido.</w:t>
+      </w:r>
+    </w:p>
+    <w:p>
+      <w:pPr>
+        <w:pStyle w:val="Heading2"/>
+      </w:pPr>
+      <w:r>
+        <w:t>3. *Commodity currencies* y el caso chileno cobre↔peso</w:t>
+      </w:r>
+    </w:p>
+    <w:p>
+      <w:r>
+        <w:t xml:space="preserve">El cobre afecta a las mineras chilenas por el canal directo (precio del producto) y el indirecto (tipo de cambio). </w:t>
+      </w:r>
+      <w:r>
+        <w:rPr>
+          <w:b/>
+        </w:rPr>
+        <w:t>Chen &amp; Rogoff (2003)</w:t>
+      </w:r>
+      <w:r>
+        <w:t xml:space="preserve"> acuñan el concepto de *commodity currency* (doi: 10.1016/S0022-1996(02)00072-7). </w:t>
+      </w:r>
+      <w:r>
+        <w:rPr>
+          <w:b/>
+        </w:rPr>
+        <w:t>Cashin, McDermott &amp; Scott (2002)</w:t>
+      </w:r>
+      <w:r>
+        <w:t xml:space="preserve"> documentan que los ciclos de precios de *commodities* son asimétricos —las caídas duran más que las alzas— (doi: 10.1016/S0304-3878(02)00062-7), lo que sugiere no linealidades y quiebres. Para Chile, </w:t>
+      </w:r>
+      <w:r>
+        <w:rPr>
+          <w:b/>
+        </w:rPr>
+        <w:t>De Gregorio &amp; Labbé (2011)</w:t>
+      </w:r>
+      <w:r>
+        <w:t xml:space="preserve">, Documento de Trabajo N°640 del Banco Central de Chile ("Copper, the Real Exchange Rate and Macroeconomic Fluctuations in Chile"), estiman que en el largo plazo una depreciación real del dólar de 10% se asocia a un alza de ~18% en el precio real del cobre y ~12% en los términos de intercambio (BCCh WP640). </w:t>
+      </w:r>
+      <w:r>
+        <w:rPr>
+          <w:b/>
+        </w:rPr>
+        <w:t>Vacío</w:t>
+      </w:r>
+      <w:r>
+        <w:t>: la literatura *commodity currency* es macro (tipo de cambio agregado); su articulación con la valoración *bursátil de empresas individuales* está poco explorada.</w:t>
+      </w:r>
+    </w:p>
+    <w:p>
+      <w:pPr>
+        <w:pStyle w:val="Heading2"/>
+      </w:pPr>
+      <w:r>
+        <w:t>4. Iliquidez, microestructura y descubrimiento de precios</w:t>
+      </w:r>
+    </w:p>
+    <w:p>
+      <w:r>
+        <w:t xml:space="preserve">Corriente diferenciadora de la tesis. La medida estándar es la de </w:t>
+      </w:r>
+      <w:r>
+        <w:rPr>
+          <w:b/>
+        </w:rPr>
+        <w:t>Amihud (2002)</w:t>
+      </w:r>
+      <w:r>
+        <w:t xml:space="preserve"> —razón entre el valor absoluto del retorno y el volumen— que captura el impacto de precio por unidad de volumen y revela una prima de iliquidez (doi: 10.1016/S1386-4181(01)00024-6). </w:t>
+      </w:r>
+      <w:r>
+        <w:rPr>
+          <w:b/>
+        </w:rPr>
+        <w:t>Amihud, Hameed, Kang &amp; Zhang (2015)</w:t>
+      </w:r>
+      <w:r>
+        <w:t xml:space="preserve"> la confirman en 45 países (doi: 10.1016/j.jfineco.2015.04.005), mayor en mercados menos desarrollados. </w:t>
+      </w:r>
+      <w:r>
+        <w:rPr>
+          <w:b/>
+        </w:rPr>
+        <w:t>Bekaert, Harvey &amp; Lundblad (2007)</w:t>
+      </w:r>
+      <w:r>
+        <w:t xml:space="preserve"> —referencia para emergentes— usan la proporción de retornos cero como proxy y muestran que la liquidez predice retornos futuros (doi: 10.1093/rfs/hhm030). Las raíces teóricas son </w:t>
+      </w:r>
+      <w:r>
+        <w:rPr>
+          <w:b/>
+        </w:rPr>
+        <w:t>Kyle (1985)</w:t>
+      </w:r>
+      <w:r>
+        <w:t xml:space="preserve"> (impacto de precio y profundidad; doi: 10.2307/1913210) y </w:t>
+      </w:r>
+      <w:r>
+        <w:rPr>
+          <w:b/>
+        </w:rPr>
+        <w:t>Roll (1984)</w:t>
+      </w:r>
+      <w:r>
+        <w:t xml:space="preserve"> (spread efectivo desde la autocovarianza; doi: 10.1111/j.1540-6261.1984.tb03897.x). </w:t>
+      </w:r>
+      <w:r>
+        <w:rPr>
+          <w:b/>
+        </w:rPr>
+        <w:t>Lesmond, Ogden &amp; Trzcinka (1999)</w:t>
+      </w:r>
+      <w:r>
+        <w:t xml:space="preserve"> proponen el estimador basado en retornos cero, útil sin datos intradía (doi: 10.1093/rfs/12.5.1113). </w:t>
+      </w:r>
+      <w:r>
+        <w:rPr>
+          <w:b/>
+        </w:rPr>
+        <w:t>Vacío</w:t>
+      </w:r>
+      <w:r>
+        <w:t xml:space="preserve">: pocos estudios examinan la iliquidez como </w:t>
+      </w:r>
+      <w:r>
+        <w:rPr>
+          <w:b/>
+        </w:rPr>
+        <w:t>moderadora de la transmisión de un factor fundamental</w:t>
+      </w:r>
+      <w:r>
+        <w:t xml:space="preserve"> (el cobre) hacia el precio.</w:t>
+      </w:r>
+    </w:p>
+    <w:p>
+      <w:pPr>
+        <w:pStyle w:val="Heading2"/>
+      </w:pPr>
+      <w:r>
+        <w:t>5. Métodos econométricos</w:t>
+      </w:r>
+    </w:p>
+    <w:p>
+      <w:r>
+        <w:t xml:space="preserve">Cointegración: enfoque bietápico de </w:t>
+      </w:r>
+      <w:r>
+        <w:rPr>
+          <w:b/>
+        </w:rPr>
+        <w:t>Engle &amp; Granger (1987)</w:t>
+      </w:r>
+      <w:r>
+        <w:t xml:space="preserve"> (doi: 10.2307/1913236) y de máxima verosimilitud de </w:t>
+      </w:r>
+      <w:r>
+        <w:rPr>
+          <w:b/>
+        </w:rPr>
+        <w:t>Johansen (1988, 1991)</w:t>
+      </w:r>
+      <w:r>
+        <w:t xml:space="preserve">. Con órdenes de integración mixtos, el *bounds testing* </w:t>
+      </w:r>
+      <w:r>
+        <w:rPr>
+          <w:b/>
+        </w:rPr>
+        <w:t>ARDL de Pesaran, Shin &amp; Smith (2001)</w:t>
+      </w:r>
+      <w:r>
+        <w:t xml:space="preserve"> (doi: 10.1002/jae.616) y su extensión no lineal </w:t>
+      </w:r>
+      <w:r>
+        <w:rPr>
+          <w:b/>
+        </w:rPr>
+        <w:t>NARDL de Shin, Yu &amp; Greenwood-Nimmo (2014)</w:t>
+      </w:r>
+      <w:r>
+        <w:t xml:space="preserve"> (doi: 10.1007/978-1-4899-8008-3_9), que captura asimetrías. Causalidad robusta a integración: </w:t>
+      </w:r>
+      <w:r>
+        <w:rPr>
+          <w:b/>
+        </w:rPr>
+        <w:t>Toda &amp; Yamamoto (1995)</w:t>
+      </w:r>
+      <w:r>
+        <w:t xml:space="preserve"> (doi: 10.1016/0304-4076(94)01616-8). Volatilidad: </w:t>
+      </w:r>
+      <w:r>
+        <w:rPr>
+          <w:b/>
+        </w:rPr>
+        <w:t>Bollerslev (1986)</w:t>
+      </w:r>
+      <w:r>
+        <w:t xml:space="preserve"> (GARCH; doi: 10.1016/0304-4076(86)90063-1), </w:t>
+      </w:r>
+      <w:r>
+        <w:rPr>
+          <w:b/>
+        </w:rPr>
+        <w:t>Nelson (1991)</w:t>
+      </w:r>
+      <w:r>
+        <w:t xml:space="preserve"> (EGARCH; doi: 10.2307/2938260) y </w:t>
+      </w:r>
+      <w:r>
+        <w:rPr>
+          <w:b/>
+        </w:rPr>
+        <w:t>Glosten, Jagannathan &amp; Runkle (1993)</w:t>
+      </w:r>
+      <w:r>
+        <w:t xml:space="preserve"> (GJR; doi: 10.1111/j.1540-6261.1993.tb05128.x).</w:t>
+      </w:r>
+    </w:p>
+    <w:p>
+      <w:pPr>
+        <w:pStyle w:val="Heading2"/>
+      </w:pPr>
+      <w:r>
+        <w:t>6. El vacío que la tesis aborda</w:t>
+      </w:r>
+    </w:p>
+    <w:p>
+      <w:r>
+        <w:t xml:space="preserve">Tres brechas convergen: (i) la literatura macro-factorial rara vez estudia *empresas individuales* en un mercado emergente delgado con escasos *pure-plays* de cobre; (ii) la de *commodity currencies* es agregada y no separa, a nivel de empresa, el canal precio-del-cobre del cambiario; (iii) la microestructura demuestra que la iliquidez está valorada, pero casi ningún trabajo la modela como </w:t>
+      </w:r>
+      <w:r>
+        <w:rPr>
+          <w:b/>
+        </w:rPr>
+        <w:t>moderadora de la velocidad e intensidad con que un choque fundamental de cobre se incorpora a la valoración</w:t>
+      </w:r>
+      <w:r>
+        <w:t>. La tesis integra un marco APT ampliado con el cobre como factor sectorial, la separación de canales, la liquidez como moderadora del descubrimiento de precios y un arsenal econométrico (VECM/ARDL/NARDL, Toda-Yamamoto, GARCH) para capturar largo plazo, asimetrías y dinámica condicional.</w:t>
+      </w:r>
+    </w:p>
+    <w:p>
+      <w:r>
+        <w:t>*Verificar:* autoría/año exactos del DT N°310 del BCCh; DOI de Boyer &amp; Filion (2007); revisita de Chen-Roll-Ross; DOI de Johansen (1991). El resto tiene autor, año, revista y DOI/URL confirmados.</w:t>
+      </w:r>
+    </w:p>
+    <w:p>
+      <w:r>
+        <w:br w:type="page"/>
+      </w:r>
+    </w:p>
+    <w:p>
+      <w:pPr>
+        <w:pStyle w:val="Heading1"/>
+      </w:pPr>
+      <w:r>
+        <w:t>Bibliografía anotada</w:t>
+      </w:r>
+    </w:p>
+    <w:p>
+      <w:r/>
+      <w:r>
+        <w:rPr>
+          <w:b/>
+        </w:rPr>
+        <w:t>Tesis:</w:t>
+      </w:r>
+      <w:r>
+        <w:t xml:space="preserve"> Cobre y valoración bursátil minera en Chile — factores macroeconómicos, retornos accionarios, *commodity currencies*, iliquidez/microestructura y metodología econométrica de series de tiempo.</w:t>
       </w:r>
     </w:p>
     <w:p>
@@ -622,439 +998,7 @@
         <w:pStyle w:val="IntenseQuote"/>
       </w:pPr>
       <w:r>
-        <w:t>sitios de los editores y repositorios (Wiley, Elsevier/ScienceDirect, Oxford,</w:t>
-      </w:r>
-    </w:p>
-    <w:p>
-      <w:pPr>
-        <w:pStyle w:val="IntenseQuote"/>
-      </w:pPr>
-      <w:r>
-        <w:t>University of Chicago Press, CFA Institute, Springer, Banco Central de Chile, NBER,</w:t>
-      </w:r>
-    </w:p>
-    <w:p>
-      <w:pPr>
-        <w:pStyle w:val="IntenseQuote"/>
-      </w:pPr>
-      <w:r>
-        <w:t>CLADEA). Marcadas como "verificar" las no confirmadas plenamente.</w:t>
-      </w:r>
-    </w:p>
-    <w:p>
-      <w:r>
-        <w:t>Este estado del arte organiza la literatura en seis corrientes interrelacionadas. La pregunta —cómo se transmiten los choques macro-financieros, en particular el precio del cobre, a la valoración bursátil de las mineras chilenas, y cómo la (i)liquidez modula esa transmisión— se sitúa en la intersección de la teoría de valoración de activos, la economía de *commodities*, la literatura de *commodity currencies* y la microestructura de mercados emergentes.</w:t>
-      </w:r>
-    </w:p>
-    <w:p>
-      <w:pPr>
-        <w:pStyle w:val="Heading2"/>
-      </w:pPr>
-      <w:r>
-        <w:t>1. Factores macroeconómicos y retornos accionarios</w:t>
-      </w:r>
-    </w:p>
-    <w:p>
-      <w:r>
-        <w:t xml:space="preserve">La base conceptual es la *Arbitrage Pricing Theory* (Ross, 1976): los retornos responden linealmente a factores de riesgo sistemático no diversificable. La contrastación canónica es </w:t>
-      </w:r>
-      <w:r>
-        <w:rPr>
-          <w:b/>
-        </w:rPr>
-        <w:t>Chen, Roll &amp; Ross (1986)</w:t>
-      </w:r>
-      <w:r>
-        <w:t xml:space="preserve">, que muestra que innovaciones en la producción industrial, la inflación esperada y no esperada, el *spread* de plazos y el *spread* de riesgo de incumplimiento están sistemáticamente valoradas en el mercado accionario (doi: 10.1086/296344). </w:t>
-      </w:r>
-      <w:r>
-        <w:rPr>
-          <w:b/>
-        </w:rPr>
-        <w:t>Se sabe</w:t>
-      </w:r>
-      <w:r>
-        <w:t xml:space="preserve"> que los factores macro afectan los retornos de forma robusta en mercados desarrollados; </w:t>
-      </w:r>
-      <w:r>
-        <w:rPr>
-          <w:b/>
-        </w:rPr>
-        <w:t>se discute</w:t>
-      </w:r>
-      <w:r>
-        <w:t xml:space="preserve"> su estabilidad temporal y su transferibilidad a emergentes; </w:t>
-      </w:r>
-      <w:r>
-        <w:rPr>
-          <w:b/>
-        </w:rPr>
-        <w:t>vacío</w:t>
-      </w:r>
-      <w:r>
-        <w:t>: la APT no especifica los factores *a priori*, lo que abre la puerta a factores sectoriales (el precio del *commodity* subyacente) no capturados por los factores macro estándar.</w:t>
-      </w:r>
-    </w:p>
-    <w:p>
-      <w:pPr>
-        <w:pStyle w:val="Heading2"/>
-      </w:pPr>
-      <w:r>
-        <w:t>2. Precios de *commodities* (cobre, petróleo) y mercados accionarios</w:t>
-      </w:r>
-    </w:p>
-    <w:p>
-      <w:r>
-        <w:t xml:space="preserve">Para empresas de recursos, el precio del producto es plausiblemente el factor dominante. </w:t>
-      </w:r>
-      <w:r>
-        <w:rPr>
-          <w:b/>
-        </w:rPr>
-        <w:t>Mendiola, Wallenstein &amp; Chávez-Bedoya (2022)</w:t>
-      </w:r>
-      <w:r>
-        <w:t xml:space="preserve"> —"Analysis of the Reaction of Mining Stocks to the Development of Copper Prices" (CLADEA)— analizan mineras de cobre en NYSE, LSE, TSX y la Bolsa de Lima y documentan una relación </w:t>
-      </w:r>
-      <w:r>
-        <w:rPr>
-          <w:b/>
-        </w:rPr>
-        <w:t>positiva pero inelástica</w:t>
-      </w:r>
-      <w:r>
-        <w:t xml:space="preserve"> entre el precio del cobre y los retornos, con efectos de la crisis de 2008 más marcados en el mercado menos desarrollado (Lima). </w:t>
-      </w:r>
-      <w:r>
-        <w:rPr>
-          <w:b/>
-        </w:rPr>
-        <w:t>Kilian &amp; Park (2009)</w:t>
-      </w:r>
-      <w:r>
-        <w:t xml:space="preserve"> muestran que la respuesta de los retornos depende del *origen* del choque (oferta vs. demanda), explicando ~22% de la varianza de largo plazo de los retornos reales de EE. UU. (doi: 10.1111/j.1468-2354.2009.00568.x): </w:t>
-      </w:r>
-      <w:r>
-        <w:rPr>
-          <w:b/>
-        </w:rPr>
-        <w:t>no basta el nivel del precio; importa la naturaleza del choque</w:t>
-      </w:r>
-      <w:r>
-        <w:t xml:space="preserve">. </w:t>
-      </w:r>
-      <w:r>
-        <w:rPr>
-          <w:b/>
-        </w:rPr>
-        <w:t>Gorton &amp; Rouwenhorst (2006)</w:t>
-      </w:r>
-      <w:r>
-        <w:t xml:space="preserve"> muestran que un índice de futuros de *commodities* ofreció retornos comparables a las acciones con correlación negativa frente a acciones y bonos (doi: 10.2469/faj.v62.n2.4083). </w:t>
-      </w:r>
-      <w:r>
-        <w:rPr>
-          <w:b/>
-        </w:rPr>
-        <w:t>Discusión/vacío</w:t>
-      </w:r>
-      <w:r>
-        <w:t>: asimetrías (¿igual respuesta a alzas que a bajas?) y dinámica de corto vs. largo plazo; pocos trabajos descomponen el choque de cobre *y* examinan empresas en un mercado emergente ilíquido.</w:t>
-      </w:r>
-    </w:p>
-    <w:p>
-      <w:pPr>
-        <w:pStyle w:val="Heading2"/>
-      </w:pPr>
-      <w:r>
-        <w:t>3. *Commodity currencies* y el caso chileno cobre↔peso</w:t>
-      </w:r>
-    </w:p>
-    <w:p>
-      <w:r>
-        <w:t xml:space="preserve">El cobre afecta a las mineras chilenas por el canal directo (precio del producto) y el indirecto (tipo de cambio). </w:t>
-      </w:r>
-      <w:r>
-        <w:rPr>
-          <w:b/>
-        </w:rPr>
-        <w:t>Chen &amp; Rogoff (2003)</w:t>
-      </w:r>
-      <w:r>
-        <w:t xml:space="preserve"> acuñan el concepto de *commodity currency* (doi: 10.1016/S0022-1996(02)00072-7). </w:t>
-      </w:r>
-      <w:r>
-        <w:rPr>
-          <w:b/>
-        </w:rPr>
-        <w:t>Cashin, McDermott &amp; Scott (2002)</w:t>
-      </w:r>
-      <w:r>
-        <w:t xml:space="preserve"> documentan que los ciclos de precios de *commodities* son asimétricos —las caídas duran más que las alzas— (doi: 10.1016/S0304-3878(02)00062-7), lo que sugiere no linealidades y quiebres. Para Chile, </w:t>
-      </w:r>
-      <w:r>
-        <w:rPr>
-          <w:b/>
-        </w:rPr>
-        <w:t>De Gregorio &amp; Labbé (2011)</w:t>
-      </w:r>
-      <w:r>
-        <w:t xml:space="preserve">, Documento de Trabajo N°640 del Banco Central de Chile ("Copper, the Real Exchange Rate and Macroeconomic Fluctuations in Chile"), estiman que en el largo plazo una depreciación real del dólar de 10% se asocia a un alza de ~18% en el precio real del cobre y ~12% en los términos de intercambio (BCCh WP640). </w:t>
-      </w:r>
-      <w:r>
-        <w:rPr>
-          <w:b/>
-        </w:rPr>
-        <w:t>Vacío</w:t>
-      </w:r>
-      <w:r>
-        <w:t>: la literatura *commodity currency* es macro (tipo de cambio agregado); su articulación con la valoración *bursátil de empresas individuales* está poco explorada.</w:t>
-      </w:r>
-    </w:p>
-    <w:p>
-      <w:pPr>
-        <w:pStyle w:val="Heading2"/>
-      </w:pPr>
-      <w:r>
-        <w:t>4. Iliquidez, microestructura y descubrimiento de precios</w:t>
-      </w:r>
-    </w:p>
-    <w:p>
-      <w:r>
-        <w:t xml:space="preserve">Corriente diferenciadora de la tesis. La medida estándar es la de </w:t>
-      </w:r>
-      <w:r>
-        <w:rPr>
-          <w:b/>
-        </w:rPr>
-        <w:t>Amihud (2002)</w:t>
-      </w:r>
-      <w:r>
-        <w:t xml:space="preserve"> —razón entre el valor absoluto del retorno y el volumen— que captura el impacto de precio por unidad de volumen y revela una prima de iliquidez (doi: 10.1016/S1386-4181(01)00024-6). </w:t>
-      </w:r>
-      <w:r>
-        <w:rPr>
-          <w:b/>
-        </w:rPr>
-        <w:t>Amihud, Hameed, Kang &amp; Zhang (2015)</w:t>
-      </w:r>
-      <w:r>
-        <w:t xml:space="preserve"> la confirman en 45 países (doi: 10.1016/j.jfineco.2015.04.005), mayor en mercados menos desarrollados. </w:t>
-      </w:r>
-      <w:r>
-        <w:rPr>
-          <w:b/>
-        </w:rPr>
-        <w:t>Bekaert, Harvey &amp; Lundblad (2007)</w:t>
-      </w:r>
-      <w:r>
-        <w:t xml:space="preserve"> —referencia para emergentes— usan la proporción de retornos cero como proxy y muestran que la liquidez predice retornos futuros (doi: 10.1093/rfs/hhm030). Las raíces teóricas son </w:t>
-      </w:r>
-      <w:r>
-        <w:rPr>
-          <w:b/>
-        </w:rPr>
-        <w:t>Kyle (1985)</w:t>
-      </w:r>
-      <w:r>
-        <w:t xml:space="preserve"> (impacto de precio y profundidad; doi: 10.2307/1913210) y </w:t>
-      </w:r>
-      <w:r>
-        <w:rPr>
-          <w:b/>
-        </w:rPr>
-        <w:t>Roll (1984)</w:t>
-      </w:r>
-      <w:r>
-        <w:t xml:space="preserve"> (spread efectivo desde la autocovarianza; doi: 10.1111/j.1540-6261.1984.tb03897.x). </w:t>
-      </w:r>
-      <w:r>
-        <w:rPr>
-          <w:b/>
-        </w:rPr>
-        <w:t>Lesmond, Ogden &amp; Trzcinka (1999)</w:t>
-      </w:r>
-      <w:r>
-        <w:t xml:space="preserve"> proponen el estimador basado en retornos cero, útil sin datos intradía (doi: 10.1093/rfs/12.5.1113). </w:t>
-      </w:r>
-      <w:r>
-        <w:rPr>
-          <w:b/>
-        </w:rPr>
-        <w:t>Vacío</w:t>
-      </w:r>
-      <w:r>
-        <w:t xml:space="preserve">: pocos estudios examinan la iliquidez como </w:t>
-      </w:r>
-      <w:r>
-        <w:rPr>
-          <w:b/>
-        </w:rPr>
-        <w:t>moderadora de la transmisión de un factor fundamental</w:t>
-      </w:r>
-      <w:r>
-        <w:t xml:space="preserve"> (el cobre) hacia el precio.</w:t>
-      </w:r>
-    </w:p>
-    <w:p>
-      <w:pPr>
-        <w:pStyle w:val="Heading2"/>
-      </w:pPr>
-      <w:r>
-        <w:t>5. Métodos econométricos</w:t>
-      </w:r>
-    </w:p>
-    <w:p>
-      <w:r>
-        <w:t xml:space="preserve">Cointegración: enfoque bietápico de </w:t>
-      </w:r>
-      <w:r>
-        <w:rPr>
-          <w:b/>
-        </w:rPr>
-        <w:t>Engle &amp; Granger (1987)</w:t>
-      </w:r>
-      <w:r>
-        <w:t xml:space="preserve"> (doi: 10.2307/1913236) y de máxima verosimilitud de </w:t>
-      </w:r>
-      <w:r>
-        <w:rPr>
-          <w:b/>
-        </w:rPr>
-        <w:t>Johansen (1988, 1991)</w:t>
-      </w:r>
-      <w:r>
-        <w:t xml:space="preserve">. Con órdenes de integración mixtos, el *bounds testing* </w:t>
-      </w:r>
-      <w:r>
-        <w:rPr>
-          <w:b/>
-        </w:rPr>
-        <w:t>ARDL de Pesaran, Shin &amp; Smith (2001)</w:t>
-      </w:r>
-      <w:r>
-        <w:t xml:space="preserve"> (doi: 10.1002/jae.616) y su extensión no lineal </w:t>
-      </w:r>
-      <w:r>
-        <w:rPr>
-          <w:b/>
-        </w:rPr>
-        <w:t>NARDL de Shin, Yu &amp; Greenwood-Nimmo (2014)</w:t>
-      </w:r>
-      <w:r>
-        <w:t xml:space="preserve"> (doi: 10.1007/978-1-4899-8008-3_9), que captura asimetrías. Causalidad robusta a integración: </w:t>
-      </w:r>
-      <w:r>
-        <w:rPr>
-          <w:b/>
-        </w:rPr>
-        <w:t>Toda &amp; Yamamoto (1995)</w:t>
-      </w:r>
-      <w:r>
-        <w:t xml:space="preserve"> (doi: 10.1016/0304-4076(94)01616-8). Volatilidad: </w:t>
-      </w:r>
-      <w:r>
-        <w:rPr>
-          <w:b/>
-        </w:rPr>
-        <w:t>Bollerslev (1986)</w:t>
-      </w:r>
-      <w:r>
-        <w:t xml:space="preserve"> (GARCH; doi: 10.1016/0304-4076(86)90063-1), </w:t>
-      </w:r>
-      <w:r>
-        <w:rPr>
-          <w:b/>
-        </w:rPr>
-        <w:t>Nelson (1991)</w:t>
-      </w:r>
-      <w:r>
-        <w:t xml:space="preserve"> (EGARCH; doi: 10.2307/2938260) y </w:t>
-      </w:r>
-      <w:r>
-        <w:rPr>
-          <w:b/>
-        </w:rPr>
-        <w:t>Glosten, Jagannathan &amp; Runkle (1993)</w:t>
-      </w:r>
-      <w:r>
-        <w:t xml:space="preserve"> (GJR; doi: 10.1111/j.1540-6261.1993.tb05128.x).</w:t>
-      </w:r>
-    </w:p>
-    <w:p>
-      <w:pPr>
-        <w:pStyle w:val="Heading2"/>
-      </w:pPr>
-      <w:r>
-        <w:t>6. El vacío que la tesis aborda</w:t>
-      </w:r>
-    </w:p>
-    <w:p>
-      <w:r>
-        <w:t xml:space="preserve">Tres brechas convergen: (i) la literatura macro-factorial rara vez estudia *empresas individuales* en un mercado emergente delgado con escasos *pure-plays* de cobre; (ii) la de *commodity currencies* es agregada y no separa, a nivel de empresa, el canal precio-del-cobre del cambiario; (iii) la microestructura demuestra que la iliquidez está valorada, pero casi ningún trabajo la modela como </w:t>
-      </w:r>
-      <w:r>
-        <w:rPr>
-          <w:b/>
-        </w:rPr>
-        <w:t>moderadora de la velocidad e intensidad con que un choque fundamental de cobre se incorpora a la valoración</w:t>
-      </w:r>
-      <w:r>
-        <w:t>. La tesis integra un marco APT ampliado con el cobre como factor sectorial, la separación de canales, la liquidez como moderadora del descubrimiento de precios y un arsenal econométrico (VECM/ARDL/NARDL, Toda-Yamamoto, GARCH) para capturar largo plazo, asimetrías y dinámica condicional.</w:t>
-      </w:r>
-    </w:p>
-    <w:p>
-      <w:r>
-        <w:t>*Verificar:* autoría/año exactos del DT N°310 del BCCh; DOI de Boyer &amp; Filion (2007); revisita de Chen-Roll-Ross; DOI de Johansen (1991). El resto tiene autor, año, revista y DOI/URL confirmados.</w:t>
-      </w:r>
-    </w:p>
-    <w:p>
-      <w:r>
-        <w:br w:type="page"/>
-      </w:r>
-    </w:p>
-    <w:p>
-      <w:pPr>
-        <w:pStyle w:val="Heading1"/>
-      </w:pPr>
-      <w:r>
-        <w:t>Bibliografía anotada</w:t>
-      </w:r>
-    </w:p>
-    <w:p>
-      <w:r/>
-      <w:r>
-        <w:rPr>
-          <w:b/>
-        </w:rPr>
-        <w:t>Tesis:</w:t>
-      </w:r>
-      <w:r>
-        <w:t xml:space="preserve"> Cobre y valoración bursátil minera en Chile — factores macroeconómicos, retornos accionarios, *commodity currencies*, iliquidez/microestructura y metodología econométrica de series de tiempo.</w:t>
-      </w:r>
-    </w:p>
-    <w:p>
-      <w:pPr>
-        <w:pStyle w:val="IntenseQuote"/>
-      </w:pPr>
-      <w:r>
-        <w:t>*Nota metodológica.* Todas las referencias fueron verificadas contra el sitio del</w:t>
-      </w:r>
-    </w:p>
-    <w:p>
-      <w:pPr>
-        <w:pStyle w:val="IntenseQuote"/>
-      </w:pPr>
-      <w:r>
-        <w:t>editor o repositorios (Wiley, ScienceDirect, JSTOR, RePEc/IDEAS, NBER, SSRN, Springer,</w:t>
-      </w:r>
-    </w:p>
-    <w:p>
-      <w:pPr>
-        <w:pStyle w:val="IntenseQuote"/>
-      </w:pPr>
-      <w:r>
-        <w:t xml:space="preserve">FMI). Lo no confirmado plenamente se marca </w:t>
+        <w:t xml:space="preserve">*Nota metodológica.* Todas las referencias fueron verificadas contra el sitio del editor o repositorios (Wiley, ScienceDirect, JSTOR, RePEc/IDEAS, NBER, SSRN, Springer, FMI). Lo no confirmado plenamente se marca </w:t>
       </w:r>
       <w:r>
         <w:rPr>
@@ -1709,15 +1653,7 @@
         <w:pStyle w:val="IntenseQuote"/>
       </w:pPr>
       <w:r>
-        <w:t>Historia del proceso de investigación: decisiones, hitos, callejones y aprendizajes.</w:t>
-      </w:r>
-    </w:p>
-    <w:p>
-      <w:pPr>
-        <w:pStyle w:val="IntenseQuote"/>
-      </w:pPr>
-      <w:r>
-        <w:t>Documenta *cómo* se construyó la tesis, no sólo el resultado.</w:t>
+        <w:t>Historia del proceso de investigación: decisiones, hitos, callejones y aprendizajes. Documenta *cómo* se construyó la tesis, no sólo el resultado.</w:t>
       </w:r>
     </w:p>
     <w:p>

</xml_diff>